<commit_message>
docs: add installable Android APK
</commit_message>
<xml_diff>
--- a/documentation/Documentation_technique_Kino.docx
+++ b/documentation/Documentation_technique_Kino.docx
@@ -21686,66 +21686,7 @@
         </w:rPr>
       </w:pPr>
       <w:r>
-        <w:rPr>
-          <w:lang w:val="fr-FR"/>
-        </w:rPr>
-        <w:t>Nous construisons l’application mobile avec EAS. Le profil `</w:t>
-      </w:r>
-      <w:proofErr w:type="spellStart"/>
-      <w:r>
-        <w:rPr>
-          <w:lang w:val="fr-FR"/>
-        </w:rPr>
-        <w:t>preview</w:t>
-      </w:r>
-      <w:proofErr w:type="spellEnd"/>
-      <w:r>
-        <w:rPr>
-          <w:lang w:val="fr-FR"/>
-        </w:rPr>
-        <w:t>` injecte l’URL de l’API de production et produit un APK Android destiné aux essais sur appareil. Avant une livraison, nous exécutons `</w:t>
-      </w:r>
-      <w:proofErr w:type="spellStart"/>
-      <w:r>
-        <w:rPr>
-          <w:lang w:val="fr-FR"/>
-        </w:rPr>
-        <w:t>npm</w:t>
-      </w:r>
-      <w:proofErr w:type="spellEnd"/>
-      <w:r>
-        <w:rPr>
-          <w:lang w:val="fr-FR"/>
-        </w:rPr>
-        <w:t xml:space="preserve"> run </w:t>
-      </w:r>
-      <w:proofErr w:type="spellStart"/>
-      <w:r>
-        <w:rPr>
-          <w:lang w:val="fr-FR"/>
-        </w:rPr>
-        <w:t>verify</w:t>
-      </w:r>
-      <w:proofErr w:type="spellEnd"/>
-      <w:r>
-        <w:rPr>
-          <w:lang w:val="fr-FR"/>
-        </w:rPr>
-        <w:t>`, puis nous contrôlons le site, `/</w:t>
-      </w:r>
-      <w:proofErr w:type="spellStart"/>
-      <w:r>
-        <w:rPr>
-          <w:lang w:val="fr-FR"/>
-        </w:rPr>
-        <w:t>healthz</w:t>
-      </w:r>
-      <w:proofErr w:type="spellEnd"/>
-      <w:r>
-        <w:rPr>
-          <w:lang w:val="fr-FR"/>
-        </w:rPr>
-        <w:t>` et un parcours connecté.</w:t>
+        <w:t>Nous construisons l’application mobile avec EAS. Le profil `preview` injecte l’URL de l’API de production et produit un APK Android destiné aux essais sur appareil. L’APK livré est conservé dans `distribution/android/Kino.apk` afin de pouvoir être installé sans relancer un build EAS. Son empreinte SHA-256 est `5C740542966D062EF34D06ED77A470EC4A47443D31C8CA94D403986CC69EA3BE`. Avant une livraison, nous exécutons `npm run verify`, puis nous contrôlons le site, `/healthz` et un parcours connecté.</w:t>
       </w:r>
     </w:p>
     <w:p>

</xml_diff>

<commit_message>
feat: change password from settings on web and mobile
</commit_message>
<xml_diff>
--- a/documentation/Documentation_technique_Kino.docx
+++ b/documentation/Documentation_technique_Kino.docx
@@ -16435,6 +16435,12 @@
         <w:t>5.2 Renouvellement côté clients</w:t>
       </w:r>
       <w:bookmarkEnd w:id="32"/>
+    </w:p>
+    <w:p>
+      <w:pPr/>
+      <w:r>
+        <w:t>Un membre connecté peut aussi modifier son mot de passe depuis les paramètres, sans passer par l'e-mail de réinitialisation. L'endpoint POST /v1/auth/password/change exige une session JWT. Si le compte possède déjà un mot de passe local, le corps contient currentPassword et newPassword ; pour un compte créé uniquement via Google, seul newPassword est nécessaire afin de définir un mot de passe complémentaire. L'API vérifie l'ancien mot de passe avec bcrypt, révoque les refresh tokens des autres sessions et renvoie une nouvelle paire de jetons. Le champ hasPassword de GET /v1/users/me indique si currentPassword est requis.</w:t>
+      </w:r>
     </w:p>
     <w:p>
       <w:pPr>

</xml_diff>

<commit_message>
feat: add SMASH picks to the Ce soir ? personal list
</commit_message>
<xml_diff>
--- a/documentation/Documentation_technique_Kino.docx
+++ b/documentation/Documentation_technique_Kino.docx
@@ -18150,6 +18150,12 @@
           <w:lang w:val="fr-FR"/>
         </w:rPr>
         <w:t xml:space="preserve"> déclenche des recommandations à 9 h et 18 h, heure de Paris. Il utilise les critiques et listes comme signaux, exclut les œuvres déjà connues et évite d’envoyer trop souvent la même recommandation.</w:t>
+      </w:r>
+    </w:p>
+    <w:p>
+      <w:pPr/>
+      <w:r>
+        <w:t>Lorsqu'un membre choisit SMASH dans Ce soir ?, POST /v1/reco/swipe enregistre la décision puis ajoute l'œuvre à une liste personnelle privée nommée « Ce soir ? ». La liste est créée automatiquement au premier like si elle n'existe pas encore. Les clients web et mobile n'ont pas de logique supplémentaire : ils appellent le même endpoint et retrouvent les œuvres gardées dans Bibliothèque → Listes.</w:t>
       </w:r>
     </w:p>
     <w:p>

</xml_diff>